<commit_message>
fix(contratos): limpia restos del formulario de montos (S/. y guiones bajos) en el Anexo 2 de las plantillas ES/EN
Las plantillas tags traian restos del formulario original: 'US$ / S/.', '_{igv}', '{monto_total}_' y 'S/. USD' (Modalidad 1); ahora renderizan 'US$ <monto>' limpio. Afecta solo contratos generados nuevos.

Mismos ajustes en contrato-textos-es/en.json (fuentes de regeneracion/traduccion) y test de regresion de plantillas (sin S/. ni guiones bajos residuales).
</commit_message>
<xml_diff>
--- a/plantillas/contrato-perumin38-tags-en.docx
+++ b/plantillas/contrato-perumin38-tags-en.docx
@@ -3790,49 +3790,49 @@
         <w:rPr>
           <w:rFonts w:ascii="Arial" w:eastAsia="Calibri" w:hAnsi="Arial" w:cs="Arial"/>
         </w:rPr>
-        <w:t xml:space="preserve">The total consideration payable by THE EXHIBITOR amounts to: US$ / S/. {monto_total}_ , which includes the General Sales Tax (18% IGV), according to the following detail:</w:t>
-      </w:r>
-    </w:p>
-    <w:p>
-      <w:pPr>
-        <w:jc w:val="both"/>
-        <w:rPr>
-          <w:rFonts w:ascii="Arial" w:hAnsi="Arial" w:cs="Arial"/>
-        </w:rPr>
-      </w:pPr>
-      <w:r>
-        <w:rPr>
-          <w:rFonts w:ascii="Arial" w:hAnsi="Arial" w:cs="Arial"/>
-        </w:rPr>
-        <w:t xml:space="preserve">⧁Sale Value (Net): US$/ S/.   {valor_venta}</w:t>
-      </w:r>
-    </w:p>
-    <w:p>
-      <w:pPr>
-        <w:jc w:val="both"/>
-        <w:rPr>
-          <w:rFonts w:ascii="Arial" w:hAnsi="Arial" w:cs="Arial"/>
-        </w:rPr>
-      </w:pPr>
-      <w:r>
-        <w:rPr>
-          <w:rFonts w:ascii="Arial" w:hAnsi="Arial" w:cs="Arial"/>
-        </w:rPr>
-        <w:t xml:space="preserve">⦁IGV (18%): US$ /  _{igv}</w:t>
-      </w:r>
-    </w:p>
-    <w:p>
-      <w:pPr>
-        <w:jc w:val="both"/>
-        <w:rPr>
-          <w:rFonts w:ascii="Arial" w:hAnsi="Arial" w:cs="Arial"/>
-        </w:rPr>
-      </w:pPr>
-      <w:r>
-        <w:rPr>
-          <w:rFonts w:ascii="Arial" w:hAnsi="Arial" w:cs="Arial"/>
-        </w:rPr>
-        <w:t xml:space="preserve">⧁Sale Price (Total Payable): US$/ S/. /  {precio_venta}</w:t>
+        <w:t xml:space="preserve">The total consideration payable by THE EXHIBITOR amounts to: US$ {monto_total}, which includes the General Sales Tax (18% IGV), according to the following detail:</w:t>
+      </w:r>
+    </w:p>
+    <w:p>
+      <w:pPr>
+        <w:jc w:val="both"/>
+        <w:rPr>
+          <w:rFonts w:ascii="Arial" w:hAnsi="Arial" w:cs="Arial"/>
+        </w:rPr>
+      </w:pPr>
+      <w:r>
+        <w:rPr>
+          <w:rFonts w:ascii="Arial" w:hAnsi="Arial" w:cs="Arial"/>
+        </w:rPr>
+        <w:t xml:space="preserve">⧁Sale Value (Net): US$ {valor_venta}</w:t>
+      </w:r>
+    </w:p>
+    <w:p>
+      <w:pPr>
+        <w:jc w:val="both"/>
+        <w:rPr>
+          <w:rFonts w:ascii="Arial" w:hAnsi="Arial" w:cs="Arial"/>
+        </w:rPr>
+      </w:pPr>
+      <w:r>
+        <w:rPr>
+          <w:rFonts w:ascii="Arial" w:hAnsi="Arial" w:cs="Arial"/>
+        </w:rPr>
+        <w:t xml:space="preserve">⦁IGV (18%): US$ {igv}</w:t>
+      </w:r>
+    </w:p>
+    <w:p>
+      <w:pPr>
+        <w:jc w:val="both"/>
+        <w:rPr>
+          <w:rFonts w:ascii="Arial" w:hAnsi="Arial" w:cs="Arial"/>
+        </w:rPr>
+      </w:pPr>
+      <w:r>
+        <w:rPr>
+          <w:rFonts w:ascii="Arial" w:hAnsi="Arial" w:cs="Arial"/>
+        </w:rPr>
+        <w:t xml:space="preserve">⧁Sale Price (Total Payable): US$ {precio_venta}</w:t>
       </w:r>
     </w:p>
     <w:p>
@@ -3884,7 +3884,7 @@
         <w:rPr>
           <w:rFonts w:ascii="Arial" w:eastAsia="Calibri" w:hAnsi="Arial" w:cs="Arial"/>
         </w:rPr>
-        <w:t xml:space="preserve">Option 1 {sel_modalidad_1}: 100% of the total cost shall be paid after signing the Contract and upon presentation of the invoice, for the sum of S/. USD {monto_modalidad_1}, within a maximum term of thirty (30) calendar days from the date of signing of the Contract. Default shall entitle IIMP to suspend delivery of the space. Definitive loss of the location and its re-marketing shall proceed once the Contract is resolved in accordance with Clause Thirteen and numeral 7 of this Annex.</w:t>
+        <w:t xml:space="preserve">Option 1 {sel_modalidad_1}: 100% of the total cost shall be paid after signing the Contract and upon presentation of the invoice, for the sum of USD {monto_modalidad_1}, within a maximum term of thirty (30) calendar days from the date of signing of the Contract. Default shall entitle IIMP to suspend delivery of the space. Definitive loss of the location and its re-marketing shall proceed once the Contract is resolved in accordance with Clause Thirteen and numeral 7 of this Annex.</w:t>
       </w:r>
     </w:p>
     <w:p>

</xml_diff>

<commit_message>
feat(contratos): cuotas personalizadas y firma digital diferida
- Implementa cronograma estándar PERUMIN 38 y configuración de N cuotas por empresa (1..9), con validación en cliente y servidor.
- Agrega Modalidad 4, snapshot del plan, regeneración segura y resolución de empresa por correo de sesión.
- Integra configuración de cuotas en /dashboard/empresas, wizard de reserva, contrato ES/EN y migración aditiva.
- Difiere la firma digital al envío y elimina la generación descartable de firmar-borrador; conserva el PDF para firma manual.
- Corrige reintentos del contrato, límite de cuotas persistidas y agrega pruebas de regresión para 4+ cuotas.
- Actualiza plantillas, scripts, documentación funcional y plan de implementación.
</commit_message>
<xml_diff>
--- a/plantillas/contrato-perumin38-tags-en.docx
+++ b/plantillas/contrato-perumin38-tags-en.docx
@@ -3883,8 +3883,30 @@
       <w:r>
         <w:rPr>
           <w:rFonts w:ascii="Arial" w:eastAsia="Calibri" w:hAnsi="Arial" w:cs="Arial"/>
-        </w:rPr>
-        <w:t xml:space="preserve">Option 1 {sel_modalidad_1}: 100% of the total cost shall be paid after signing the Contract and upon presentation of the invoice, for the sum of USD {monto_modalidad_1}, within a maximum term of thirty (30) calendar days from the date of signing of the Contract. Default shall entitle IIMP to suspend delivery of the space. Definitive loss of the location and its re-marketing shall proceed once the Contract is resolved in accordance with Clause Thirteen and numeral 7 of this Annex.</w:t>
+          <w:b/>
+          <w:bCs/>
+        </w:rPr>
+        <w:t xml:space="preserve">Option 1 {sel_modalidad_1}: </w:t>
+      </w:r>
+      <w:r>
+        <w:rPr>
+          <w:rFonts w:ascii="Arial" w:eastAsia="Calibri" w:hAnsi="Arial" w:cs="Arial"/>
+        </w:rPr>
+        <w:t xml:space="preserve">100% of the total cost shall be paid after signing the Contract and upon presentation of the invoice, for the sum of USD {monto_modalidad_1}, within a maximum term of thirty (30) calendar days from the date of signing of the Contract. Default shall entitle </w:t>
+      </w:r>
+      <w:r>
+        <w:rPr>
+          <w:rFonts w:ascii="Arial" w:eastAsia="Calibri" w:hAnsi="Arial" w:cs="Arial"/>
+          <w:b/>
+          <w:bCs/>
+        </w:rPr>
+        <w:t xml:space="preserve">IIMP</w:t>
+      </w:r>
+      <w:r>
+        <w:rPr>
+          <w:rFonts w:ascii="Arial" w:eastAsia="Calibri" w:hAnsi="Arial" w:cs="Arial"/>
+        </w:rPr>
+        <w:t xml:space="preserve"> to suspend delivery of the space. Definitive loss of the location and its re-marketing shall proceed once the Contract is resolved in accordance with Clause Thirteen and numeral 7 of this Annex.</w:t>
       </w:r>
     </w:p>
     <w:p>
@@ -3898,8 +3920,30 @@
       <w:r>
         <w:rPr>
           <w:rFonts w:ascii="Arial" w:hAnsi="Arial" w:cs="Arial"/>
-        </w:rPr>
-        <w:t xml:space="preserve">Option 2 {sel_modalidad_2}: (i) 50% of the total cost, after signing the Contract and upon prior presentation of the invoice, within thirty (30) business days after the reservation. Default shall entitle IIMP to suspend delivery of the space. Definitive loss of the location and its re-marketing shall proceed once the Contract is resolved in accordance with Clause Thirteen and numeral 7 of this Annex; and (ii) the remaining 50%, within forty-five (45) business days after payment of the first 50% and upon prior presentation of the corresponding invoice.</w:t>
+          <w:b/>
+          <w:bCs/>
+        </w:rPr>
+        <w:t xml:space="preserve">Option 2 {sel_modalidad_2}: </w:t>
+      </w:r>
+      <w:r>
+        <w:rPr>
+          <w:rFonts w:ascii="Arial" w:hAnsi="Arial" w:cs="Arial"/>
+        </w:rPr>
+        <w:t xml:space="preserve">(i) 50% of the total cost, after signing the Contract and upon prior presentation of the invoice, within thirty (30) business days after the reservation. Default shall entitle </w:t>
+      </w:r>
+      <w:r>
+        <w:rPr>
+          <w:rFonts w:ascii="Arial" w:hAnsi="Arial" w:cs="Arial"/>
+          <w:b/>
+          <w:bCs/>
+        </w:rPr>
+        <w:t xml:space="preserve">IIMP</w:t>
+      </w:r>
+      <w:r>
+        <w:rPr>
+          <w:rFonts w:ascii="Arial" w:hAnsi="Arial" w:cs="Arial"/>
+        </w:rPr>
+        <w:t xml:space="preserve"> to suspend delivery of the space. Definitive loss of the location and its re-marketing shall proceed once the Contract is resolved in accordance with Clause Thirteen and numeral 7 of this Annex; and (ii) the remaining 50%, within forty-five (45) business days after payment of the first 50% and upon prior presentation of the corresponding invoice.</w:t>
       </w:r>
     </w:p>
     <w:p>
@@ -3913,8 +3957,83 @@
       <w:r>
         <w:rPr>
           <w:rFonts w:ascii="Arial" w:hAnsi="Arial" w:cs="Arial"/>
-        </w:rPr>
-        <w:t xml:space="preserve">Option 3 {sel_modalidad_3}: customized schedule according to client configuration.{#cuotas_contrato}</w:t>
+          <w:b/>
+          <w:bCs/>
+        </w:rPr>
+        <w:t xml:space="preserve">Option 3 {sel_modalidad_3}: </w:t>
+      </w:r>
+      <w:r>
+        <w:rPr>
+          <w:rFonts w:ascii="Arial" w:hAnsi="Arial" w:cs="Arial"/>
+        </w:rPr>
+        <w:t xml:space="preserve">40% of the total cost shall be paid within thirty (30) business days after the reservation, upon signing the Contract and presentation of the corresponding invoice; the remaining 30% shall be paid within forty-five (45) business days after payment of the first installment; and the last installment, equivalent to 30% of the total cost, shall be paid within the following thirty (30) business days, upon presentation of the corresponding invoice. Default on the first payment shall entitle </w:t>
+      </w:r>
+      <w:r>
+        <w:rPr>
+          <w:rFonts w:ascii="Arial" w:hAnsi="Arial" w:cs="Arial"/>
+          <w:b/>
+          <w:bCs/>
+        </w:rPr>
+        <w:t xml:space="preserve">IIMP</w:t>
+      </w:r>
+      <w:r>
+        <w:rPr>
+          <w:rFonts w:ascii="Arial" w:hAnsi="Arial" w:cs="Arial"/>
+        </w:rPr>
+        <w:t xml:space="preserve"> to suspend delivery of the space. Definitive loss of the location and its re-marketing shall proceed once the Contract is resolved, in accordance with Clause Thirteen and numeral 7 of this Annex.</w:t>
+      </w:r>
+    </w:p>
+    <w:p>
+      <w:pPr>
+        <w:spacing w:after="200"/>
+        <w:jc w:val="both"/>
+        <w:rPr>
+          <w:rFonts w:ascii="Arial" w:hAnsi="Arial" w:cs="Arial"/>
+        </w:rPr>
+      </w:pPr>
+      <w:r>
+        <w:rPr>
+          <w:rFonts w:ascii="Arial" w:hAnsi="Arial" w:cs="Arial"/>
+          <w:b/>
+          <w:bCs/>
+        </w:rPr>
+        <w:t xml:space="preserve">Option 4 {sel_modalidad_4}: </w:t>
+      </w:r>
+      <w:r>
+        <w:rPr>
+          <w:rFonts w:ascii="Arial" w:hAnsi="Arial" w:cs="Arial"/>
+        </w:rPr>
+        <w:t xml:space="preserve">customized schedule according to client configuration.</w:t>
+      </w:r>
+    </w:p>
+    <w:p>
+      <w:pPr>
+        <w:spacing w:after="200"/>
+        <w:jc w:val="both"/>
+        <w:rPr>
+          <w:rFonts w:ascii="Arial" w:hAnsi="Arial" w:cs="Arial"/>
+        </w:rPr>
+      </w:pPr>
+      <w:r>
+        <w:rPr>
+          <w:rFonts w:ascii="Arial" w:hAnsi="Arial" w:cs="Arial"/>
+        </w:rPr>
+        <w:t xml:space="preserve">Selected payment schedule:</w:t>
+      </w:r>
+    </w:p>
+    <w:p>
+      <w:pPr>
+        <w:spacing w:after="200"/>
+        <w:jc w:val="both"/>
+        <w:rPr>
+          <w:rFonts w:ascii="Arial" w:hAnsi="Arial" w:cs="Arial"/>
+        </w:rPr>
+      </w:pPr>
+      <w:r>
+        <w:rPr>
+          <w:rFonts w:ascii="Arial" w:hAnsi="Arial" w:cs="Arial"/>
+        </w:rPr>
+        <w:t xml:space="preserve">{#cuotas_contrato}</w:t>
       </w:r>
     </w:p>
     <w:p>

</xml_diff>

<commit_message>
feat(portal): sincroniza representantes legales adicionales
- Agrega representantes adicionales con persistencia, baja logica y sincronizacion entre validar datos, perfil y wizard.
- Reordena la identificacion por documento, activa la busqueda RENIEC automatica y mueve la partida electronica a la empresa.
- Incluye los representantes adicionales en el contrato con tipo y numero de documento, partida y datos de contacto.
- Ajusta el flujo para que el contrato se genere y habilite desde la bandeja del revisor; el wizard solo crea la solicitud y adjunta anexos.
- Actualiza plantillas DOCX, migraciones, documentacion y pruebas.

Validado con tsc, lint y tests de contrato, empresas, wizard y validadores.
</commit_message>
<xml_diff>
--- a/plantillas/contrato-perumin38-tags-en.docx
+++ b/plantillas/contrato-perumin38-tags-en.docx
@@ -47,6 +47,57 @@
           <w:color w:val="000000" w:themeColor="text1"/>
         </w:rPr>
         <w:t xml:space="preserve">This document evidences the Exhibition Contract (hereinafter the "Contract") entered into, on the one part, by the INSTITUTO DE INGENIEROS DE MINAS DEL PERÚ, with RUC 20107972090, with address at Calle Los Canarios 155-157, District of La Molina, Province and Department of Lima, duly represented by its General Manager, Mr. Gustavo Adolfo de Vinatea Bellatin, identified with DNI No. 07615912, with powers registered under Electronic File No. 11014857 of the Registry of Legal Entities of Lima, hereinafter referred to as IIMP; and, on the other part, {razon_social}, with RUC/RUT/TaxID, or equivalent No. {ruc}, with address at {domicilio_fiscal}, duly represented by {representante_legal}, identified with DNI/ identification card/ ID Card/Passport or other equivalent No. {dni_representante}, with powers registered under Electronic File No. {partida_electronica} of the Registry of Legal Entities of Lima (if applicable), hereinafter referred to simply as THE EXHIBITOR, in accordance with the particular terms set forth in this document and the General Exhibition Conditions of PERUMIN 38 and its Annexes.</w:t>
+      </w:r>
+    </w:p>
+    <w:p>
+      <w:pPr>
+        <w:spacing w:after="240"/>
+        <w:jc w:val="both"/>
+        <w:rPr>
+          <w:rFonts w:ascii="Arial" w:eastAsia="Calibri" w:hAnsi="Arial" w:cs="Arial"/>
+          <w:color w:val="000000" w:themeColor="text1"/>
+        </w:rPr>
+      </w:pPr>
+      <w:r>
+        <w:rPr>
+          <w:rFonts w:ascii="Arial" w:eastAsia="Calibri" w:hAnsi="Arial" w:cs="Arial"/>
+          <w:color w:val="000000" w:themeColor="text1"/>
+        </w:rPr>
+        <w:t xml:space="preserve">{#representantes_adicionales}</w:t>
+      </w:r>
+    </w:p>
+    <w:p>
+      <w:pPr>
+        <w:spacing w:after="240"/>
+        <w:jc w:val="both"/>
+        <w:rPr>
+          <w:rFonts w:ascii="Arial" w:eastAsia="Calibri" w:hAnsi="Arial" w:cs="Arial"/>
+          <w:color w:val="000000" w:themeColor="text1"/>
+        </w:rPr>
+      </w:pPr>
+      <w:r>
+        <w:rPr>
+          <w:rFonts w:ascii="Arial" w:eastAsia="Calibri" w:hAnsi="Arial" w:cs="Arial"/>
+          <w:color w:val="000000" w:themeColor="text1"/>
+        </w:rPr>
+        <w:t xml:space="preserve">Additionally, the following legal representative of THE EXHIBITOR appears: {nombre}, identified with {tipoDocumento} No. {documento}, with powers registered in the Electronic Registry No. {partida_electronica} (if applicable), email {correo}, phone {celular}.</w:t>
+      </w:r>
+    </w:p>
+    <w:p>
+      <w:pPr>
+        <w:spacing w:after="240"/>
+        <w:jc w:val="both"/>
+        <w:rPr>
+          <w:rFonts w:ascii="Arial" w:eastAsia="Calibri" w:hAnsi="Arial" w:cs="Arial"/>
+          <w:color w:val="000000" w:themeColor="text1"/>
+        </w:rPr>
+      </w:pPr>
+      <w:r>
+        <w:rPr>
+          <w:rFonts w:ascii="Arial" w:eastAsia="Calibri" w:hAnsi="Arial" w:cs="Arial"/>
+          <w:color w:val="000000" w:themeColor="text1"/>
+        </w:rPr>
+        <w:t xml:space="preserve">{/representantes_adicionales}</w:t>
       </w:r>
     </w:p>
     <w:p>

</xml_diff>